<commit_message>
docs: correct wrong testing completion report (entregable)
</commit_message>
<xml_diff>
--- a/docs/entregas/ENTREGA-test_management_modulo2.docx
+++ b/docs/entregas/ENTREGA-test_management_modulo2.docx
@@ -1304,7 +1304,7 @@
       </w:pPr>
       <w:sdt>
         <w:sdtPr>
-          <w:id w:val="426016404"/>
+          <w:id w:val="-699727629"/>
           <w:tag w:val="goog_rdk_0"/>
         </w:sdtPr>
         <w:sdtContent>
@@ -3171,7 +3171,7 @@
       </w:pPr>
       <w:sdt>
         <w:sdtPr>
-          <w:id w:val="-2069286383"/>
+          <w:id w:val="-411526299"/>
           <w:tag w:val="goog_rdk_1"/>
         </w:sdtPr>
         <w:sdtContent>
@@ -4154,6 +4154,41 @@
             </w:r>
             <w:r>
               <w:rPr>
+                <w:rFonts w:ascii="Roboto Mono" w:cs="Roboto Mono" w:eastAsia="Roboto Mono" w:hAnsi="Roboto Mono"/>
+                <w:i w:val="1"/>
+                <w:iCs w:val="1"/>
+                <w:color w:val="188038"/>
+                <w:sz w:val="20"/>
+                <w:szCs w:val="20"/>
+                <w:rtl w:val="0"/>
+              </w:rPr>
+              <w:t xml:space="preserve">auth.service.spec.ts</w:t>
+            </w:r>
+            <w:r>
+              <w:rPr>
+                <w:i w:val="1"/>
+                <w:iCs w:val="1"/>
+                <w:color w:val="6b7280"/>
+                <w:sz w:val="20"/>
+                <w:szCs w:val="20"/>
+                <w:rtl w:val="0"/>
+              </w:rPr>
+              <w:t xml:space="preserve"> — </w:t>
+            </w:r>
+            <w:r>
+              <w:rPr>
+                <w:rFonts w:ascii="Roboto Mono" w:cs="Roboto Mono" w:eastAsia="Roboto Mono" w:hAnsi="Roboto Mono"/>
+                <w:i w:val="1"/>
+                <w:iCs w:val="1"/>
+                <w:color w:val="188038"/>
+                <w:sz w:val="20"/>
+                <w:szCs w:val="20"/>
+                <w:rtl w:val="0"/>
+              </w:rPr>
+              <w:t xml:space="preserve">bloquea la cuenta después de 5 intentos fallidos — BUG-05</w:t>
+            </w:r>
+            <w:r>
+              <w:rPr>
                 <w:rtl w:val="0"/>
               </w:rPr>
             </w:r>
@@ -4310,6 +4345,41 @@
             </w:r>
             <w:r>
               <w:rPr>
+                <w:rFonts w:ascii="Roboto Mono" w:cs="Roboto Mono" w:eastAsia="Roboto Mono" w:hAnsi="Roboto Mono"/>
+                <w:i w:val="1"/>
+                <w:iCs w:val="1"/>
+                <w:color w:val="188038"/>
+                <w:sz w:val="20"/>
+                <w:szCs w:val="20"/>
+                <w:rtl w:val="0"/>
+              </w:rPr>
+              <w:t xml:space="preserve">projects.integration.test.ts</w:t>
+            </w:r>
+            <w:r>
+              <w:rPr>
+                <w:i w:val="1"/>
+                <w:iCs w:val="1"/>
+                <w:color w:val="6b7280"/>
+                <w:sz w:val="20"/>
+                <w:szCs w:val="20"/>
+                <w:rtl w:val="0"/>
+              </w:rPr>
+              <w:t xml:space="preserve"> — </w:t>
+            </w:r>
+            <w:r>
+              <w:rPr>
+                <w:rFonts w:ascii="Roboto Mono" w:cs="Roboto Mono" w:eastAsia="Roboto Mono" w:hAnsi="Roboto Mono"/>
+                <w:i w:val="1"/>
+                <w:iCs w:val="1"/>
+                <w:color w:val="188038"/>
+                <w:sz w:val="20"/>
+                <w:szCs w:val="20"/>
+                <w:rtl w:val="0"/>
+              </w:rPr>
+              <w:t xml:space="preserve">crea un proyecto y devuelve 201 con id (@US-03)</w:t>
+            </w:r>
+            <w:r>
+              <w:rPr>
                 <w:rtl w:val="0"/>
               </w:rPr>
             </w:r>
@@ -4466,6 +4536,41 @@
             </w:r>
             <w:r>
               <w:rPr>
+                <w:rFonts w:ascii="Roboto Mono" w:cs="Roboto Mono" w:eastAsia="Roboto Mono" w:hAnsi="Roboto Mono"/>
+                <w:i w:val="1"/>
+                <w:iCs w:val="1"/>
+                <w:color w:val="188038"/>
+                <w:sz w:val="20"/>
+                <w:szCs w:val="20"/>
+                <w:rtl w:val="0"/>
+              </w:rPr>
+              <w:t xml:space="preserve">tasks.integration.test.ts</w:t>
+            </w:r>
+            <w:r>
+              <w:rPr>
+                <w:i w:val="1"/>
+                <w:iCs w:val="1"/>
+                <w:color w:val="6b7280"/>
+                <w:sz w:val="20"/>
+                <w:szCs w:val="20"/>
+                <w:rtl w:val="0"/>
+              </w:rPr>
+              <w:t xml:space="preserve"> — </w:t>
+            </w:r>
+            <w:r>
+              <w:rPr>
+                <w:rFonts w:ascii="Roboto Mono" w:cs="Roboto Mono" w:eastAsia="Roboto Mono" w:hAnsi="Roboto Mono"/>
+                <w:i w:val="1"/>
+                <w:iCs w:val="1"/>
+                <w:color w:val="188038"/>
+                <w:sz w:val="20"/>
+                <w:szCs w:val="20"/>
+                <w:rtl w:val="0"/>
+              </w:rPr>
+              <w:t xml:space="preserve">crea una tarea con prioridad válida (@US-05 CA-18)</w:t>
+            </w:r>
+            <w:r>
+              <w:rPr>
                 <w:rtl w:val="0"/>
               </w:rPr>
             </w:r>
@@ -4622,6 +4727,49 @@
             </w:r>
             <w:r>
               <w:rPr>
+                <w:rFonts w:ascii="Roboto Mono" w:cs="Roboto Mono" w:eastAsia="Roboto Mono" w:hAnsi="Roboto Mono"/>
+                <w:i w:val="1"/>
+                <w:iCs w:val="1"/>
+                <w:color w:val="188038"/>
+                <w:sz w:val="20"/>
+                <w:szCs w:val="20"/>
+                <w:rtl w:val="0"/>
+              </w:rPr>
+              <w:t xml:space="preserve">task.state-machine.spec.ts</w:t>
+            </w:r>
+            <w:r>
+              <w:rPr>
+                <w:i w:val="1"/>
+                <w:iCs w:val="1"/>
+                <w:color w:val="6b7280"/>
+                <w:sz w:val="20"/>
+                <w:szCs w:val="20"/>
+                <w:rtl w:val="0"/>
+              </w:rPr>
+              <w:t xml:space="preserve"> — </w:t>
+            </w:r>
+            <w:sdt>
+              <w:sdtPr>
+                <w:id w:val="-119665552"/>
+                <w:tag w:val="goog_rdk_2"/>
+              </w:sdtPr>
+              <w:sdtContent>
+                <w:r>
+                  <w:rPr>
+                    <w:rFonts w:ascii="Arial Unicode MS" w:cs="Arial Unicode MS" w:eastAsia="Arial Unicode MS" w:hAnsi="Arial Unicode MS"/>
+                    <w:i w:val="1"/>
+                    <w:iCs w:val="1"/>
+                    <w:color w:val="188038"/>
+                    <w:sz w:val="20"/>
+                    <w:szCs w:val="20"/>
+                    <w:rtl w:val="0"/>
+                  </w:rPr>
+                  <w:t xml:space="preserve">TODO → IN_PROGRESS ✓</w:t>
+                </w:r>
+              </w:sdtContent>
+            </w:sdt>
+            <w:r>
+              <w:rPr>
                 <w:rtl w:val="0"/>
               </w:rPr>
             </w:r>
@@ -4831,8 +4979,8 @@
       </w:pPr>
       <w:sdt>
         <w:sdtPr>
-          <w:id w:val="-967048734"/>
-          <w:tag w:val="goog_rdk_2"/>
+          <w:id w:val="-1595766865"/>
+          <w:tag w:val="goog_rdk_3"/>
         </w:sdtPr>
         <w:sdtContent>
           <w:r>
@@ -6005,8 +6153,8 @@
             </w:pPr>
             <w:sdt>
               <w:sdtPr>
-                <w:id w:val="1133757720"/>
-                <w:tag w:val="goog_rdk_3"/>
+                <w:id w:val="741074775"/>
+                <w:tag w:val="goog_rdk_4"/>
               </w:sdtPr>
               <w:sdtContent>
                 <w:r>
@@ -7054,8 +7202,8 @@
             </w:pPr>
             <w:sdt>
               <w:sdtPr>
-                <w:id w:val="1408658736"/>
-                <w:tag w:val="goog_rdk_4"/>
+                <w:id w:val="-1907843318"/>
+                <w:tag w:val="goog_rdk_5"/>
               </w:sdtPr>
               <w:sdtContent>
                 <w:r>
@@ -7202,8 +7350,8 @@
             </w:pPr>
             <w:sdt>
               <w:sdtPr>
-                <w:id w:val="-1937376990"/>
-                <w:tag w:val="goog_rdk_5"/>
+                <w:id w:val="-1096471830"/>
+                <w:tag w:val="goog_rdk_6"/>
               </w:sdtPr>
               <w:sdtContent>
                 <w:r>
@@ -7489,8 +7637,8 @@
             </w:pPr>
             <w:sdt>
               <w:sdtPr>
-                <w:id w:val="1664770845"/>
-                <w:tag w:val="goog_rdk_6"/>
+                <w:id w:val="-1663348297"/>
+                <w:tag w:val="goog_rdk_7"/>
               </w:sdtPr>
               <w:sdtContent>
                 <w:r>
@@ -12005,7 +12153,7 @@
 
 <file path=customXML/item1.xml><?xml version="1.0" encoding="utf-8"?>
 <go:gDocsCustomXmlDataStorage xmlns:go="http://customooxmlschemas.google.com/" xmlns:r="http://schemas.openxmlformats.org/officeDocument/2006/relationships" uri="GoogleDocsCustomDataVersion2">
-  <go:docsCustomData xmlns:go="http://customooxmlschemas.google.com/" roundtripDataSignature="AMtx7mhfqGkPeYpRS23WGVBUEF599Zvr7g==">CgMxLjAaHQoBMBIYChYIB0ISEhBBcmlhbCBVbmljb2RlIE1TGiMKATESHgocCAdCGAoLQ291cmllciBOZXcSCUZpcmEgTW9ubxodCgEyEhgKFggHQhISEEFyaWFsIFVuaWNvZGUgTVMaHQoBMxIYChYIB0ISEhBBcmlhbCBVbmljb2RlIE1TGh0KATQSGAoWCAdCEhIQQXJpYWwgVW5pY29kZSBNUxodCgE1EhgKFggHQhISEEFyaWFsIFVuaWNvZGUgTVMaHQoBNhIYChYIB0ISEhBBcmlhbCBVbmljb2RlIE1TOAByITFFbzFocF9WSmttLWEyNDVUc00tRjRoUm5ocWdoVTBYbA==</go:docsCustomData>
+  <go:docsCustomData xmlns:go="http://customooxmlschemas.google.com/" roundtripDataSignature="AMtx7mihVGmN+xqjkdvar12kqaCXt5ZuEw==">CgMxLjAaHQoBMBIYChYIB0ISEhBBcmlhbCBVbmljb2RlIE1TGiMKATESHgocCAdCGAoLQ291cmllciBOZXcSCUZpcmEgTW9ubxoqCgEyEiUKIwgHQh8KC1JvYm90byBNb25vEhBBcmlhbCBVbmljb2RlIE1TGh0KATMSGAoWCAdCEhIQQXJpYWwgVW5pY29kZSBNUxodCgE0EhgKFggHQhISEEFyaWFsIFVuaWNvZGUgTVMaHQoBNRIYChYIB0ISEhBBcmlhbCBVbmljb2RlIE1TGh0KATYSGAoWCAdCEhIQQXJpYWwgVW5pY29kZSBNUxodCgE3EhgKFggHQhISEEFyaWFsIFVuaWNvZGUgTVM4AHIhMUVvMWhwX1ZKa20tYTI0NVRzTS1GNGhSbmhxZ2hVMFhs</go:docsCustomData>
 </go:gDocsCustomXmlDataStorage>
 </file>
 

</xml_diff>